<commit_message>
Add PhD student alumni to people page and push all thesis files
</commit_message>
<xml_diff>
--- a/Group Members.docx
+++ b/Group Members.docx
@@ -8,7 +8,15 @@
       </w:r>
       <w:r>
         <w:br/>
-        <w:t>However in recent years, he has become very interested in how the brain (and behaviour) changes over time. This has led him to investigate neurodevelopment in animals and humans and how certain drugs such as alcohol and psychedelics change our brain an and behaviour.</w:t>
+        <w:t xml:space="preserve">However in recent years, he has become very interested in how the brain (and behaviour) changes over time. This has led him to investigate neurodevelopment in animals and humans and how certain drugs such as alcohol and psychedelics change our brain </w:t>
+      </w:r>
+      <w:proofErr w:type="gramStart"/>
+      <w:r>
+        <w:t>an and</w:t>
+      </w:r>
+      <w:proofErr w:type="gramEnd"/>
+      <w:r>
+        <w:t xml:space="preserve"> behaviour.</w:t>
       </w:r>
     </w:p>
     <w:p>
@@ -43,7 +51,7 @@
     <w:p>
       <w:r>
         <w:pict w14:anchorId="627ADE87">
-          <v:rect id="_x0000_i1031" style="width:0;height:1.5pt" o:hralign="center" o:hrstd="t" o:hr="t" fillcolor="#a0a0a0" stroked="f"/>
+          <v:rect id="_x0000_i1025" style="width:0;height:1.5pt" o:hralign="center" o:hrstd="t" o:hr="t" fillcolor="#a0a0a0" stroked="f"/>
         </w:pict>
       </w:r>
     </w:p>
@@ -158,7 +166,15 @@
         <w:t xml:space="preserve">joined NEST in the middle of 2025. I </w:t>
       </w:r>
       <w:r>
-        <w:t>am a PhD researcher working on the effects of psychedelic compounds on neurogenesis, using planarians as a model system. My research focuses on molecular and cellular mechanisms related to drug development, rather than behavioral studies. I have strong laboratory experience and work mainly with molecular biology</w:t>
+        <w:t xml:space="preserve">am a PhD researcher working on the effects of psychedelic compounds on neurogenesis, using planarians as a model system. My research focuses on molecular and cellular mechanisms related to drug development, rather than </w:t>
+      </w:r>
+      <w:proofErr w:type="spellStart"/>
+      <w:r>
+        <w:t>behavioral</w:t>
+      </w:r>
+      <w:proofErr w:type="spellEnd"/>
+      <w:r>
+        <w:t xml:space="preserve"> studies. I have strong laboratory experience and work mainly with molecular biology</w:t>
       </w:r>
       <w:r>
         <w:t>, immunohistochemical</w:t>
@@ -254,7 +270,15 @@
         <w:t>-</w:t>
       </w:r>
       <w:r>
-        <w:t xml:space="preserve">year psychology student finishing off my BPsyc, majoring in Brain Science and Mental Health! </w:t>
+        <w:t xml:space="preserve">year psychology student finishing off my </w:t>
+      </w:r>
+      <w:proofErr w:type="spellStart"/>
+      <w:r>
+        <w:t>BPsyc</w:t>
+      </w:r>
+      <w:proofErr w:type="spellEnd"/>
+      <w:r>
+        <w:t xml:space="preserve">, majoring in Brain Science and Mental Health! </w:t>
       </w:r>
       <w:r>
         <w:t xml:space="preserve">As part of my SCIE306 </w:t>
@@ -284,15 +308,47 @@
         <w:t xml:space="preserve">activity, </w:t>
       </w:r>
       <w:r>
-        <w:t>shapes and behavio</w:t>
-      </w:r>
-      <w:r>
-        <w:t>r of planaria.</w:t>
-      </w:r>
-    </w:p>
-    <w:p>
-      <w:r>
-        <w:t>A huge range of psychological research interests me, but learning about neurobiology and gene-environment interactions, especially the imapct of the gut microbiome, especially piques my passion. This year, I am also doing an internship under the Tindall Foundation utilising exisiting kaupapa Māori and/or Pasifika frameworks and methodologies to support the mental well-being of birthing parents in their perinatal phase.</w:t>
+        <w:t xml:space="preserve">shapes and </w:t>
+      </w:r>
+      <w:proofErr w:type="spellStart"/>
+      <w:r>
+        <w:t>behavio</w:t>
+      </w:r>
+      <w:r>
+        <w:t>r</w:t>
+      </w:r>
+      <w:proofErr w:type="spellEnd"/>
+      <w:r>
+        <w:t xml:space="preserve"> of planaria.</w:t>
+      </w:r>
+    </w:p>
+    <w:p>
+      <w:r>
+        <w:t xml:space="preserve">A huge range of psychological research interests me, but learning about neurobiology and gene-environment interactions, especially the </w:t>
+      </w:r>
+      <w:proofErr w:type="spellStart"/>
+      <w:r>
+        <w:t>imapct</w:t>
+      </w:r>
+      <w:proofErr w:type="spellEnd"/>
+      <w:r>
+        <w:t xml:space="preserve"> of the gut microbiome, especially piques my passion. This year, I am also doing an internship under the Tindall Foundation utilising </w:t>
+      </w:r>
+      <w:proofErr w:type="spellStart"/>
+      <w:r>
+        <w:t>exisiting</w:t>
+      </w:r>
+      <w:proofErr w:type="spellEnd"/>
+      <w:r>
+        <w:t xml:space="preserve"> </w:t>
+      </w:r>
+      <w:proofErr w:type="spellStart"/>
+      <w:r>
+        <w:t>kaupapa</w:t>
+      </w:r>
+      <w:proofErr w:type="spellEnd"/>
+      <w:r>
+        <w:t xml:space="preserve"> Māori and/or Pasifika frameworks and methodologies to support the mental well-being of birthing parents in their perinatal phase.</w:t>
       </w:r>
       <w:r>
         <w:br w:type="page"/>
@@ -369,7 +425,84 @@
         <w:t>the NEST.</w:t>
       </w:r>
       <w:r>
-        <w:t xml:space="preserve"> I pitch in to help students wherever asked (usually in the biology lab or writing feedback), while my own work focuses on how maternal inflammation during early/mid-pregnancy may impact the foetoplacental regulation of serotonin. Serotonin has its sticky fingers in the activity of everything from microglia to mitochondria, so changes in prenatal serotonin availability may have a plethora of downstream neurodevelopmental implications. This includes in the symptomology and aetiology of diagnoses such as schizophrenia spectrum, autism spectrum, and depressive disorders. There's plenty of PhD's worth of research left to do in this area - if you're looking for something interesting to research, I can recommend it and am happy to chat about it!</w:t>
+        <w:t xml:space="preserve"> I pitch in to help students wherever asked (usually in the biology lab or writing feedback), while my own work focuses on how maternal inflammation during early/mid-pregnancy may impact the </w:t>
+      </w:r>
+      <w:proofErr w:type="spellStart"/>
+      <w:r>
+        <w:t>foetoplacental</w:t>
+      </w:r>
+      <w:proofErr w:type="spellEnd"/>
+      <w:r>
+        <w:t xml:space="preserve"> regulation of serotonin. Serotonin has its sticky fingers in the activity of everything from microglia to mitochondria, so changes in prenatal serotonin availability may have a plethora of downstream neurodevelopmental implications. This includes in the symptomology and aetiology of diagnoses such as schizophrenia spectrum, autism spectrum, and depressive disorders. There's plenty of PhD's worth of research left to do in this area - if you're looking for something interesting to research, I can recommend it and am happy to chat about it!</w:t>
+      </w:r>
+    </w:p>
+    <w:p/>
+    <w:p/>
+    <w:p>
+      <w:r>
+        <w:lastRenderedPageBreak/>
+        <w:t>Alumni</w:t>
+      </w:r>
+    </w:p>
+    <w:p/>
+    <w:p>
+      <w:r>
+        <w:t>PhD Students</w:t>
+      </w:r>
+    </w:p>
+    <w:p>
+      <w:r>
+        <w:t>2015 Alana Oakly</w:t>
+      </w:r>
+    </w:p>
+    <w:p>
+      <w:r>
+        <w:t>2016 Bridget Brox</w:t>
+      </w:r>
+    </w:p>
+    <w:p>
+      <w:r>
+        <w:t>2016 Hanna Squire</w:t>
+      </w:r>
+    </w:p>
+    <w:p>
+      <w:r>
+        <w:t>2016 Peter Ranger</w:t>
+      </w:r>
+    </w:p>
+    <w:p>
+      <w:r>
+        <w:t>2016 Uta Waterhouse</w:t>
+      </w:r>
+    </w:p>
+    <w:p>
+      <w:r>
+        <w:t>2020 Michaela Pettie</w:t>
+      </w:r>
+    </w:p>
+    <w:p>
+      <w:r>
+        <w:t>2021 Linda Wilkin Krug</w:t>
+      </w:r>
+    </w:p>
+    <w:p>
+      <w:r>
+        <w:t>2023 Kate Witt</w:t>
+      </w:r>
+    </w:p>
+    <w:p>
+      <w:r>
+        <w:t>2024 Larissa Rocha</w:t>
+      </w:r>
+    </w:p>
+    <w:p>
+      <w:r>
+        <w:t>2024 Sahir Hussain</w:t>
+      </w:r>
+    </w:p>
+    <w:p>
+      <w:r>
+        <w:br w:type="page"/>
       </w:r>
     </w:p>
     <w:p/>
@@ -986,6 +1119,7 @@
   <w:style w:type="character" w:default="1" w:styleId="DefaultParagraphFont">
     <w:name w:val="Default Paragraph Font"/>
     <w:uiPriority w:val="1"/>
+    <w:semiHidden/>
     <w:unhideWhenUsed/>
   </w:style>
   <w:style w:type="table" w:default="1" w:styleId="TableNormal">

</xml_diff>

<commit_message>
Add biography and photo for Stefan Trybula to the people page
</commit_message>
<xml_diff>
--- a/Group Members.docx
+++ b/Group Members.docx
@@ -441,63 +441,27 @@
     <w:p>
       <w:r>
         <w:lastRenderedPageBreak/>
-        <w:t>Alumni</w:t>
+        <w:t>Stefan Trybula</w:t>
       </w:r>
     </w:p>
     <w:p/>
     <w:p>
       <w:r>
-        <w:t>PhD Students</w:t>
-      </w:r>
-    </w:p>
-    <w:p>
-      <w:r>
-        <w:t>2015 Alana Oakly</w:t>
-      </w:r>
-    </w:p>
-    <w:p>
-      <w:r>
-        <w:t>2016 Bridget Brox</w:t>
-      </w:r>
-    </w:p>
-    <w:p>
-      <w:r>
-        <w:t>2016 Hanna Squire</w:t>
-      </w:r>
-    </w:p>
-    <w:p>
-      <w:r>
-        <w:t>2016 Peter Ranger</w:t>
-      </w:r>
-    </w:p>
-    <w:p>
-      <w:r>
-        <w:t>2016 Uta Waterhouse</w:t>
-      </w:r>
-    </w:p>
-    <w:p>
-      <w:r>
-        <w:t>2020 Michaela Pettie</w:t>
-      </w:r>
-    </w:p>
-    <w:p>
-      <w:r>
-        <w:t>2021 Linda Wilkin Krug</w:t>
-      </w:r>
-    </w:p>
-    <w:p>
-      <w:r>
-        <w:t>2023 Kate Witt</w:t>
-      </w:r>
-    </w:p>
-    <w:p>
-      <w:r>
-        <w:t>2024 Larissa Rocha</w:t>
-      </w:r>
-    </w:p>
-    <w:p>
-      <w:r>
-        <w:t>2024 Sahir Hussain</w:t>
+        <w:t xml:space="preserve">Hi, I'm Stefan, a </w:t>
+      </w:r>
+      <w:proofErr w:type="gramStart"/>
+      <w:r>
+        <w:t>Master's</w:t>
+      </w:r>
+      <w:proofErr w:type="gramEnd"/>
+      <w:r>
+        <w:t xml:space="preserve"> student in the NEST. My research focuses on addiction and what makes tobacco smoking so much harder to quit than nicotine alone. My current project focuses on developing a nicotine vapour self-administration procedure in rats, which will help us to better understand the role that other tobacco compounds play in driving addiction.</w:t>
+      </w:r>
+    </w:p>
+    <w:p/>
+    <w:p>
+      <w:r>
+        <w:t>My broader clinical interests centre on people with severe and chronic mental health conditions who don't seek out intervention or therapy themselves, a population that is often underserved and underrepresented in research. Outside the lab, I work as a mental health support worker with people under the Mental Health Act, which keeps me grounded in the realities of what such science is ultimately for.</w:t>
       </w:r>
     </w:p>
     <w:p>
@@ -505,6 +469,7 @@
         <w:br w:type="page"/>
       </w:r>
     </w:p>
+    <w:p/>
     <w:p/>
     <w:sectPr>
       <w:pgSz w:w="11906" w:h="16838"/>
@@ -1119,7 +1084,6 @@
   <w:style w:type="character" w:default="1" w:styleId="DefaultParagraphFont">
     <w:name w:val="Default Paragraph Font"/>
     <w:uiPriority w:val="1"/>
-    <w:semiHidden/>
     <w:unhideWhenUsed/>
   </w:style>
   <w:style w:type="table" w:default="1" w:styleId="TableNormal">

</xml_diff>

<commit_message>
Add Myles Cubitt to group members website profile
</commit_message>
<xml_diff>
--- a/Group Members.docx
+++ b/Group Members.docx
@@ -467,6 +467,40 @@
     <w:p>
       <w:r>
         <w:br w:type="page"/>
+      </w:r>
+    </w:p>
+    <w:p>
+      <w:r>
+        <w:lastRenderedPageBreak/>
+        <w:t>Myles Cubitt</w:t>
+      </w:r>
+    </w:p>
+    <w:p/>
+    <w:p/>
+    <w:p>
+      <w:r>
+        <w:t>Howdy, I’m Myles! A PhD candidate in NEST. I come from a different academic background, having completed a Bachelor of Arts and Science with a major in Biochemistry &amp; Philosophy, followed by Honours in Psychology at the University of Otago.</w:t>
+      </w:r>
+    </w:p>
+    <w:p>
+      <w:r>
+        <w:t>My research in the NEST group is a collaboration with Anne Haase from the school of health and explores</w:t>
+      </w:r>
+      <w:r>
+        <w:t xml:space="preserve"> </w:t>
+      </w:r>
+      <w:r>
+        <w:t>how metabolic and cell signalling abnormalities contribute to the development of severe mental illnesses, particularly schizophrenia and bipolar disorder. My work focuses on how insulin resistance and mitochondrial dysfunction interact with key anabolic and catabolic signalling pathways, including PI3K/AKT and mTOR, to influence neurodevelopment, cellular metabolism, neuroinflammation, and synaptic plasticity.</w:t>
+      </w:r>
+    </w:p>
+    <w:p>
+      <w:r>
+        <w:t>By integrating evidence from neuroscience, molecular biology, metabolism, and psychiatry, I aim to develop a more unified mechanistic understanding of these disorders. Ultimately, I hope this work will help identify novel biomarkers and therapeutic targets that could improve early intervention and lead to more effective treatments. I'm particularly interested in translating basic biological discoveries into clinically meaningful advances that improve outcomes for people living with severe mental illness.</w:t>
+      </w:r>
+    </w:p>
+    <w:p>
+      <w:r>
+        <w:t> </w:t>
       </w:r>
     </w:p>
     <w:p/>

</xml_diff>

<commit_message>
Add Chris Hobbs to group members website profile
</commit_message>
<xml_diff>
--- a/Group Members.docx
+++ b/Group Members.docx
@@ -504,6 +504,38 @@
       </w:r>
     </w:p>
     <w:p/>
+    <w:p>
+      <w:r>
+        <w:br w:type="page"/>
+      </w:r>
+    </w:p>
+    <w:p/>
+    <w:p>
+      <w:r>
+        <w:t>Hi, I'm Chris, a </w:t>
+      </w:r>
+      <w:proofErr w:type="gramStart"/>
+      <w:r>
+        <w:t>Master's</w:t>
+      </w:r>
+      <w:proofErr w:type="gramEnd"/>
+      <w:r>
+        <w:t> student in Psychology in the NEST research group. Before returning to university, I spent more than forty years working professionally as an international actor. My research grew out of my own experiences of self-medicating with alcohol during my acting career and a long-standing question that emerged during my previous </w:t>
+      </w:r>
+      <w:proofErr w:type="gramStart"/>
+      <w:r>
+        <w:t>Master's</w:t>
+      </w:r>
+      <w:proofErr w:type="gramEnd"/>
+      <w:r>
+        <w:t> degree at Toi Whakaari: can the creativity and vulnerability I once believed alcohol provided be rediscovered through healthier pathways? </w:t>
+      </w:r>
+    </w:p>
+    <w:p>
+      <w:r>
+        <w:t>My research explores self-medication among performers who believe alcohol or other substances improve their creative performance. Alongside this, I am investigating whether the physiological fight-or-flight response that underpins performance anxiety can be redirected into a powerful creative state. Drawing on neuroscience, psychology, and lived experience, my research aims to better understand the mechanisms underlying creative performance and to contribute to the development of evidence-based approaches that support healthier, more sustainable pathways for performers.  </w:t>
+      </w:r>
+    </w:p>
     <w:p/>
     <w:sectPr>
       <w:pgSz w:w="11906" w:h="16838"/>

</xml_diff>

<commit_message>
Add Matt Keay to people and home page, update profile image
</commit_message>
<xml_diff>
--- a/Group Members.docx
+++ b/Group Members.docx
@@ -8,15 +8,7 @@
       </w:r>
       <w:r>
         <w:br/>
-        <w:t xml:space="preserve">However in recent years, he has become very interested in how the brain (and behaviour) changes over time. This has led him to investigate neurodevelopment in animals and humans and how certain drugs such as alcohol and psychedelics change our brain </w:t>
-      </w:r>
-      <w:proofErr w:type="gramStart"/>
-      <w:r>
-        <w:t>an and</w:t>
-      </w:r>
-      <w:proofErr w:type="gramEnd"/>
-      <w:r>
-        <w:t xml:space="preserve"> behaviour.</w:t>
+        <w:t>However in recent years, he has become very interested in how the brain (and behaviour) changes over time. This has led him to investigate neurodevelopment in animals and humans and how certain drugs such as alcohol and psychedelics change our brain an and behaviour.</w:t>
       </w:r>
     </w:p>
     <w:p>
@@ -447,15 +439,7 @@
     <w:p/>
     <w:p>
       <w:r>
-        <w:t xml:space="preserve">Hi, I'm Stefan, a </w:t>
-      </w:r>
-      <w:proofErr w:type="gramStart"/>
-      <w:r>
-        <w:t>Master's</w:t>
-      </w:r>
-      <w:proofErr w:type="gramEnd"/>
-      <w:r>
-        <w:t xml:space="preserve"> student in the NEST. My research focuses on addiction and what makes tobacco smoking so much harder to quit than nicotine alone. My current project focuses on developing a nicotine vapour self-administration procedure in rats, which will help us to better understand the role that other tobacco compounds play in driving addiction.</w:t>
+        <w:t>Hi, I'm Stefan, a Master's student in the NEST. My research focuses on addiction and what makes tobacco smoking so much harder to quit than nicotine alone. My current project focuses on developing a nicotine vapour self-administration procedure in rats, which will help us to better understand the role that other tobacco compounds play in driving addiction.</w:t>
       </w:r>
     </w:p>
     <w:p/>
@@ -512,23 +496,7 @@
     <w:p/>
     <w:p>
       <w:r>
-        <w:t>Hi, I'm Chris, a </w:t>
-      </w:r>
-      <w:proofErr w:type="gramStart"/>
-      <w:r>
-        <w:t>Master's</w:t>
-      </w:r>
-      <w:proofErr w:type="gramEnd"/>
-      <w:r>
-        <w:t> student in Psychology in the NEST research group. Before returning to university, I spent more than forty years working professionally as an international actor. My research grew out of my own experiences of self-medicating with alcohol during my acting career and a long-standing question that emerged during my previous </w:t>
-      </w:r>
-      <w:proofErr w:type="gramStart"/>
-      <w:r>
-        <w:t>Master's</w:t>
-      </w:r>
-      <w:proofErr w:type="gramEnd"/>
-      <w:r>
-        <w:t> degree at Toi Whakaari: can the creativity and vulnerability I once believed alcohol provided be rediscovered through healthier pathways? </w:t>
+        <w:t>Hi, I'm Chris, a Master's student in Psychology in the NEST research group. Before returning to university, I spent more than forty years working professionally as an international actor. My research grew out of my own experiences of self-medicating with alcohol during my acting career and a long-standing question that emerged during my previous Master's degree at Toi Whakaari: can the creativity and vulnerability I once believed alcohol provided be rediscovered through healthier pathways? </w:t>
       </w:r>
     </w:p>
     <w:p>
@@ -536,7 +504,30 @@
         <w:t>My research explores self-medication among performers who believe alcohol or other substances improve their creative performance. Alongside this, I am investigating whether the physiological fight-or-flight response that underpins performance anxiety can be redirected into a powerful creative state. Drawing on neuroscience, psychology, and lived experience, my research aims to better understand the mechanisms underlying creative performance and to contribute to the development of evidence-based approaches that support healthier, more sustainable pathways for performers.  </w:t>
       </w:r>
     </w:p>
+    <w:p>
+      <w:r>
+        <w:br w:type="page"/>
+      </w:r>
+    </w:p>
+    <w:p>
+      <w:r>
+        <w:lastRenderedPageBreak/>
+        <w:t>Matt Keay</w:t>
+      </w:r>
+    </w:p>
     <w:p/>
+    <w:p>
+      <w:r>
+        <w:t>Kia ora! I’m Matt, a Master’s student within the NEST research group. This year, I am researching classical threat conditioning in planaria. Specifically, I want to determine whether these flatworms can be conditioned to associate specific environments with danger, and how substances such as benzodiazepines and psilocybin impact the acquisition or reconsolidation of these threat memories.</w:t>
+      </w:r>
+      <w:r>
+        <w:br/>
+      </w:r>
+      <w:r>
+        <w:br/>
+        <w:t>By studying planaria, whose central nervous system is in many ways surprisingly similar to our own, we can gain fundamental insights into the cellular and behavioural mechanics of memory. I am deeply interested in the clinical applications of psychology, and I hope this work will contribute to the collective effort to better understand, and ultimately treat, anxiety and post-traumatic stress disorders.</w:t>
+      </w:r>
+    </w:p>
     <w:sectPr>
       <w:pgSz w:w="11906" w:h="16838"/>
       <w:pgMar w:top="1440" w:right="1440" w:bottom="1440" w:left="1440" w:header="708" w:footer="708" w:gutter="0"/>

</xml_diff>

<commit_message>
Add Lena Clarke to group members on index and people pages
</commit_message>
<xml_diff>
--- a/Group Members.docx
+++ b/Group Members.docx
@@ -8,7 +8,15 @@
       </w:r>
       <w:r>
         <w:br/>
-        <w:t>However in recent years, he has become very interested in how the brain (and behaviour) changes over time. This has led him to investigate neurodevelopment in animals and humans and how certain drugs such as alcohol and psychedelics change our brain an and behaviour.</w:t>
+        <w:t xml:space="preserve">However in recent years, he has become very interested in how the brain (and behaviour) changes over time. This has led him to investigate neurodevelopment in animals and humans and how certain drugs such as alcohol and psychedelics change our brain </w:t>
+      </w:r>
+      <w:proofErr w:type="gramStart"/>
+      <w:r>
+        <w:t>an and</w:t>
+      </w:r>
+      <w:proofErr w:type="gramEnd"/>
+      <w:r>
+        <w:t xml:space="preserve"> behaviour.</w:t>
       </w:r>
     </w:p>
     <w:p>
@@ -183,17 +191,8 @@
     </w:p>
     <w:p>
       <w:r>
-        <w:lastRenderedPageBreak/>
         <w:br w:type="page"/>
       </w:r>
-    </w:p>
-    <w:p>
-      <w:pPr>
-        <w:rPr>
-          <w:b/>
-          <w:bCs/>
-        </w:rPr>
-      </w:pPr>
       <w:r>
         <w:rPr>
           <w:b/>
@@ -439,7 +438,15 @@
     <w:p/>
     <w:p>
       <w:r>
-        <w:t>Hi, I'm Stefan, a Master's student in the NEST. My research focuses on addiction and what makes tobacco smoking so much harder to quit than nicotine alone. My current project focuses on developing a nicotine vapour self-administration procedure in rats, which will help us to better understand the role that other tobacco compounds play in driving addiction.</w:t>
+        <w:t xml:space="preserve">Hi, I'm Stefan, a </w:t>
+      </w:r>
+      <w:proofErr w:type="gramStart"/>
+      <w:r>
+        <w:t>Master's</w:t>
+      </w:r>
+      <w:proofErr w:type="gramEnd"/>
+      <w:r>
+        <w:t xml:space="preserve"> student in the NEST. My research focuses on addiction and what makes tobacco smoking so much harder to quit than nicotine alone. My current project focuses on developing a nicotine vapour self-administration procedure in rats, which will help us to better understand the role that other tobacco compounds play in driving addiction.</w:t>
       </w:r>
     </w:p>
     <w:p/>
@@ -496,7 +503,23 @@
     <w:p/>
     <w:p>
       <w:r>
-        <w:t>Hi, I'm Chris, a Master's student in Psychology in the NEST research group. Before returning to university, I spent more than forty years working professionally as an international actor. My research grew out of my own experiences of self-medicating with alcohol during my acting career and a long-standing question that emerged during my previous Master's degree at Toi Whakaari: can the creativity and vulnerability I once believed alcohol provided be rediscovered through healthier pathways? </w:t>
+        <w:t>Hi, I'm Chris, a </w:t>
+      </w:r>
+      <w:proofErr w:type="gramStart"/>
+      <w:r>
+        <w:t>Master's</w:t>
+      </w:r>
+      <w:proofErr w:type="gramEnd"/>
+      <w:r>
+        <w:t> student in Psychology in the NEST research group. Before returning to university, I spent more than forty years working professionally as an international actor. My research grew out of my own experiences of self-medicating with alcohol during my acting career and a long-standing question that emerged during my previous </w:t>
+      </w:r>
+      <w:proofErr w:type="gramStart"/>
+      <w:r>
+        <w:t>Master's</w:t>
+      </w:r>
+      <w:proofErr w:type="gramEnd"/>
+      <w:r>
+        <w:t> degree at Toi Whakaari: can the creativity and vulnerability I once believed alcohol provided be rediscovered through healthier pathways? </w:t>
       </w:r>
     </w:p>
     <w:p>
@@ -518,7 +541,15 @@
     <w:p/>
     <w:p>
       <w:r>
-        <w:t>Kia ora! I’m Matt, a Master’s student within the NEST research group. This year, I am researching classical threat conditioning in planaria. Specifically, I want to determine whether these flatworms can be conditioned to associate specific environments with danger, and how substances such as benzodiazepines and psilocybin impact the acquisition or reconsolidation of these threat memories.</w:t>
+        <w:t xml:space="preserve">Kia ora! I’m Matt, a </w:t>
+      </w:r>
+      <w:proofErr w:type="gramStart"/>
+      <w:r>
+        <w:t>Master’s</w:t>
+      </w:r>
+      <w:proofErr w:type="gramEnd"/>
+      <w:r>
+        <w:t xml:space="preserve"> student within the NEST research group. This year, I am researching classical threat conditioning in planaria. Specifically, I want to determine whether these flatworms can be conditioned to associate specific environments with danger, and how substances such as benzodiazepines and psilocybin impact the acquisition or reconsolidation of these threat memories.</w:t>
       </w:r>
       <w:r>
         <w:br/>
@@ -528,6 +559,47 @@
         <w:t>By studying planaria, whose central nervous system is in many ways surprisingly similar to our own, we can gain fundamental insights into the cellular and behavioural mechanics of memory. I am deeply interested in the clinical applications of psychology, and I hope this work will contribute to the collective effort to better understand, and ultimately treat, anxiety and post-traumatic stress disorders.</w:t>
       </w:r>
     </w:p>
+    <w:p>
+      <w:r>
+        <w:br w:type="page"/>
+      </w:r>
+    </w:p>
+    <w:p>
+      <w:r>
+        <w:lastRenderedPageBreak/>
+        <w:t>L</w:t>
+      </w:r>
+      <w:r>
+        <w:t>ena Clarke</w:t>
+      </w:r>
+      <w:r>
+        <w:br/>
+      </w:r>
+    </w:p>
+    <w:p>
+      <w:r>
+        <w:t xml:space="preserve">Hiya! I'm Lena, a psychology student who is very excited to have joined the NEST research group in 2026 as part of my </w:t>
+      </w:r>
+      <w:proofErr w:type="gramStart"/>
+      <w:r>
+        <w:t>BSc(</w:t>
+      </w:r>
+      <w:proofErr w:type="gramEnd"/>
+      <w:r>
+        <w:t>Hons). Though I primarily have a passion for cognitive psychology, I thoroughly enjoyed studying cell biology, biopsychology, and biochemistry during my undergraduate years. I also love exploring the overlap and interaction between these fields, and so I am grateful for the opportunity to combine all my learning in a hands-on way through NEST! </w:t>
+      </w:r>
+    </w:p>
+    <w:p>
+      <w:r>
+        <w:t> </w:t>
+      </w:r>
+    </w:p>
+    <w:p>
+      <w:r>
+        <w:t>I am currently doing a methods development project looking into the effects of different types of light on planarian behaviour, with the intention of finding suitable stimuli for future experiments exploring classical conditioning and (ideally) latent inhibition in this emerging model species. So far, this is proving quite challenging. But I am eager to keep trying and hopefully help establish protocol that may be useful for many behavioural research projects to come!</w:t>
+      </w:r>
+    </w:p>
+    <w:p/>
     <w:sectPr>
       <w:pgSz w:w="11906" w:h="16838"/>
       <w:pgMar w:top="1440" w:right="1440" w:bottom="1440" w:left="1440" w:header="708" w:footer="708" w:gutter="0"/>
@@ -1141,6 +1213,7 @@
   <w:style w:type="character" w:default="1" w:styleId="DefaultParagraphFont">
     <w:name w:val="Default Paragraph Font"/>
     <w:uiPriority w:val="1"/>
+    <w:semiHidden/>
     <w:unhideWhenUsed/>
   </w:style>
   <w:style w:type="table" w:default="1" w:styleId="TableNormal">

</xml_diff>

<commit_message>
Add Meyrick Kidwell and Kavya Thomas to group members list and bios
</commit_message>
<xml_diff>
--- a/Group Members.docx
+++ b/Group Members.docx
@@ -599,6 +599,71 @@
         <w:t>I am currently doing a methods development project looking into the effects of different types of light on planarian behaviour, with the intention of finding suitable stimuli for future experiments exploring classical conditioning and (ideally) latent inhibition in this emerging model species. So far, this is proving quite challenging. But I am eager to keep trying and hopefully help establish protocol that may be useful for many behavioural research projects to come!</w:t>
       </w:r>
     </w:p>
+    <w:p>
+      <w:r>
+        <w:br w:type="page"/>
+      </w:r>
+    </w:p>
+    <w:p>
+      <w:r>
+        <w:lastRenderedPageBreak/>
+        <w:t>Meyrick Kidwell</w:t>
+      </w:r>
+    </w:p>
+    <w:p/>
+    <w:p>
+      <w:r>
+        <w:t>Hi I’m Meyrick. I have recently handed in my PhD thesis on heart rate variability (HRV) in rodent models, focusing on developing a foundational understanding of how HRV can be studied in rodents and be positioned as a translational biomarker of psychiatric illness in humans.</w:t>
+      </w:r>
+    </w:p>
+    <w:p>
+      <w:r>
+        <w:t xml:space="preserve">While my PhD focussed on HRV, my interest </w:t>
+      </w:r>
+      <w:proofErr w:type="gramStart"/>
+      <w:r>
+        <w:t>are</w:t>
+      </w:r>
+      <w:proofErr w:type="gramEnd"/>
+      <w:r>
+        <w:t xml:space="preserve"> multidisciplinary having conducted a broad range of experiments for my master’s thesis, from immunohistochemistry to examine neurogenesis in early development, to the rewarding nature of social interaction using conditioned place preference. Ive also been lucky to be included in many of the new exciting projects and collaborations over my years working within this research group, constantly learning and developing new skills which I can then teach others who are just as passionate about the research as I am.</w:t>
+      </w:r>
+    </w:p>
+    <w:p/>
+    <w:p>
+      <w:r>
+        <w:br w:type="page"/>
+      </w:r>
+    </w:p>
+    <w:p>
+      <w:r>
+        <w:lastRenderedPageBreak/>
+        <w:t>Hi, I’m Kavya!</w:t>
+      </w:r>
+    </w:p>
+    <w:p>
+      <w:r>
+        <w:t xml:space="preserve">I’m doing my </w:t>
+      </w:r>
+      <w:proofErr w:type="spellStart"/>
+      <w:proofErr w:type="gramStart"/>
+      <w:r>
+        <w:t>Masters</w:t>
+      </w:r>
+      <w:proofErr w:type="spellEnd"/>
+      <w:proofErr w:type="gramEnd"/>
+      <w:r>
+        <w:t xml:space="preserve"> Thesis in Cognitive and Behavioural Neuroscience, after getting my BSc majoring in Psych. For my thesis, I’m looking into the ways that hormonal changes affect brain activity, and how this might be moderated by genotype. I’m doing this through the help of my supervisors Bart Ellenbroek and Burt Hatch, using the Adolescent Brain Cognitive Development Study data, which looks at youth in USA. I'm passionate about neurophysiology and psychology, and hope that my work might help understand under-researched phenomena in female populations. </w:t>
+      </w:r>
+    </w:p>
+    <w:p/>
+    <w:p>
+      <w:r>
+        <w:t>Outside of my thesis, I tutor undergraduate Psychology courses at VUW, and spend my time reading and baking :) </w:t>
+      </w:r>
+    </w:p>
+    <w:p/>
+    <w:p/>
     <w:p/>
     <w:sectPr>
       <w:pgSz w:w="11906" w:h="16838"/>
@@ -1213,7 +1278,6 @@
   <w:style w:type="character" w:default="1" w:styleId="DefaultParagraphFont">
     <w:name w:val="Default Paragraph Font"/>
     <w:uiPriority w:val="1"/>
-    <w:semiHidden/>
     <w:unhideWhenUsed/>
   </w:style>
   <w:style w:type="table" w:default="1" w:styleId="TableNormal">

</xml_diff>

<commit_message>
Add Annie Jencova to group members on index and people pages
</commit_message>
<xml_diff>
--- a/Group Members.docx
+++ b/Group Members.docx
@@ -8,15 +8,7 @@
       </w:r>
       <w:r>
         <w:br/>
-        <w:t xml:space="preserve">However in recent years, he has become very interested in how the brain (and behaviour) changes over time. This has led him to investigate neurodevelopment in animals and humans and how certain drugs such as alcohol and psychedelics change our brain </w:t>
-      </w:r>
-      <w:proofErr w:type="gramStart"/>
-      <w:r>
-        <w:t>an and</w:t>
-      </w:r>
-      <w:proofErr w:type="gramEnd"/>
-      <w:r>
-        <w:t xml:space="preserve"> behaviour.</w:t>
+        <w:t>However in recent years, he has become very interested in how the brain (and behaviour) changes over time. This has led him to investigate neurodevelopment in animals and humans and how certain drugs such as alcohol and psychedelics change our brain an and behaviour.</w:t>
       </w:r>
     </w:p>
     <w:p>
@@ -166,15 +158,7 @@
         <w:t xml:space="preserve">joined NEST in the middle of 2025. I </w:t>
       </w:r>
       <w:r>
-        <w:t xml:space="preserve">am a PhD researcher working on the effects of psychedelic compounds on neurogenesis, using planarians as a model system. My research focuses on molecular and cellular mechanisms related to drug development, rather than </w:t>
-      </w:r>
-      <w:proofErr w:type="spellStart"/>
-      <w:r>
-        <w:t>behavioral</w:t>
-      </w:r>
-      <w:proofErr w:type="spellEnd"/>
-      <w:r>
-        <w:t xml:space="preserve"> studies. I have strong laboratory experience and work mainly with molecular biology</w:t>
+        <w:t>am a PhD researcher working on the effects of psychedelic compounds on neurogenesis, using planarians as a model system. My research focuses on molecular and cellular mechanisms related to drug development, rather than behavioral studies. I have strong laboratory experience and work mainly with molecular biology</w:t>
       </w:r>
       <w:r>
         <w:t>, immunohistochemical</w:t>
@@ -261,15 +245,7 @@
         <w:t>-</w:t>
       </w:r>
       <w:r>
-        <w:t xml:space="preserve">year psychology student finishing off my </w:t>
-      </w:r>
-      <w:proofErr w:type="spellStart"/>
-      <w:r>
-        <w:t>BPsyc</w:t>
-      </w:r>
-      <w:proofErr w:type="spellEnd"/>
-      <w:r>
-        <w:t xml:space="preserve">, majoring in Brain Science and Mental Health! </w:t>
+        <w:t xml:space="preserve">year psychology student finishing off my BPsyc, majoring in Brain Science and Mental Health! </w:t>
       </w:r>
       <w:r>
         <w:t xml:space="preserve">As part of my SCIE306 </w:t>
@@ -299,47 +275,15 @@
         <w:t xml:space="preserve">activity, </w:t>
       </w:r>
       <w:r>
-        <w:t xml:space="preserve">shapes and </w:t>
-      </w:r>
-      <w:proofErr w:type="spellStart"/>
-      <w:r>
-        <w:t>behavio</w:t>
-      </w:r>
-      <w:r>
-        <w:t>r</w:t>
-      </w:r>
-      <w:proofErr w:type="spellEnd"/>
-      <w:r>
-        <w:t xml:space="preserve"> of planaria.</w:t>
-      </w:r>
-    </w:p>
-    <w:p>
-      <w:r>
-        <w:t xml:space="preserve">A huge range of psychological research interests me, but learning about neurobiology and gene-environment interactions, especially the </w:t>
-      </w:r>
-      <w:proofErr w:type="spellStart"/>
-      <w:r>
-        <w:t>imapct</w:t>
-      </w:r>
-      <w:proofErr w:type="spellEnd"/>
-      <w:r>
-        <w:t xml:space="preserve"> of the gut microbiome, especially piques my passion. This year, I am also doing an internship under the Tindall Foundation utilising </w:t>
-      </w:r>
-      <w:proofErr w:type="spellStart"/>
-      <w:r>
-        <w:t>exisiting</w:t>
-      </w:r>
-      <w:proofErr w:type="spellEnd"/>
-      <w:r>
-        <w:t xml:space="preserve"> </w:t>
-      </w:r>
-      <w:proofErr w:type="spellStart"/>
-      <w:r>
-        <w:t>kaupapa</w:t>
-      </w:r>
-      <w:proofErr w:type="spellEnd"/>
-      <w:r>
-        <w:t xml:space="preserve"> Māori and/or Pasifika frameworks and methodologies to support the mental well-being of birthing parents in their perinatal phase.</w:t>
+        <w:t>shapes and behavio</w:t>
+      </w:r>
+      <w:r>
+        <w:t>r of planaria.</w:t>
+      </w:r>
+    </w:p>
+    <w:p>
+      <w:r>
+        <w:t>A huge range of psychological research interests me, but learning about neurobiology and gene-environment interactions, especially the imapct of the gut microbiome, especially piques my passion. This year, I am also doing an internship under the Tindall Foundation utilising exisiting kaupapa Māori and/or Pasifika frameworks and methodologies to support the mental well-being of birthing parents in their perinatal phase.</w:t>
       </w:r>
       <w:r>
         <w:br w:type="page"/>
@@ -416,15 +360,7 @@
         <w:t>the NEST.</w:t>
       </w:r>
       <w:r>
-        <w:t xml:space="preserve"> I pitch in to help students wherever asked (usually in the biology lab or writing feedback), while my own work focuses on how maternal inflammation during early/mid-pregnancy may impact the </w:t>
-      </w:r>
-      <w:proofErr w:type="spellStart"/>
-      <w:r>
-        <w:t>foetoplacental</w:t>
-      </w:r>
-      <w:proofErr w:type="spellEnd"/>
-      <w:r>
-        <w:t xml:space="preserve"> regulation of serotonin. Serotonin has its sticky fingers in the activity of everything from microglia to mitochondria, so changes in prenatal serotonin availability may have a plethora of downstream neurodevelopmental implications. This includes in the symptomology and aetiology of diagnoses such as schizophrenia spectrum, autism spectrum, and depressive disorders. There's plenty of PhD's worth of research left to do in this area - if you're looking for something interesting to research, I can recommend it and am happy to chat about it!</w:t>
+        <w:t xml:space="preserve"> I pitch in to help students wherever asked (usually in the biology lab or writing feedback), while my own work focuses on how maternal inflammation during early/mid-pregnancy may impact the foetoplacental regulation of serotonin. Serotonin has its sticky fingers in the activity of everything from microglia to mitochondria, so changes in prenatal serotonin availability may have a plethora of downstream neurodevelopmental implications. This includes in the symptomology and aetiology of diagnoses such as schizophrenia spectrum, autism spectrum, and depressive disorders. There's plenty of PhD's worth of research left to do in this area - if you're looking for something interesting to research, I can recommend it and am happy to chat about it!</w:t>
       </w:r>
     </w:p>
     <w:p/>
@@ -438,15 +374,7 @@
     <w:p/>
     <w:p>
       <w:r>
-        <w:t xml:space="preserve">Hi, I'm Stefan, a </w:t>
-      </w:r>
-      <w:proofErr w:type="gramStart"/>
-      <w:r>
-        <w:t>Master's</w:t>
-      </w:r>
-      <w:proofErr w:type="gramEnd"/>
-      <w:r>
-        <w:t xml:space="preserve"> student in the NEST. My research focuses on addiction and what makes tobacco smoking so much harder to quit than nicotine alone. My current project focuses on developing a nicotine vapour self-administration procedure in rats, which will help us to better understand the role that other tobacco compounds play in driving addiction.</w:t>
+        <w:t>Hi, I'm Stefan, a Master's student in the NEST. My research focuses on addiction and what makes tobacco smoking so much harder to quit than nicotine alone. My current project focuses on developing a nicotine vapour self-administration procedure in rats, which will help us to better understand the role that other tobacco compounds play in driving addiction.</w:t>
       </w:r>
     </w:p>
     <w:p/>
@@ -503,23 +431,7 @@
     <w:p/>
     <w:p>
       <w:r>
-        <w:t>Hi, I'm Chris, a </w:t>
-      </w:r>
-      <w:proofErr w:type="gramStart"/>
-      <w:r>
-        <w:t>Master's</w:t>
-      </w:r>
-      <w:proofErr w:type="gramEnd"/>
-      <w:r>
-        <w:t> student in Psychology in the NEST research group. Before returning to university, I spent more than forty years working professionally as an international actor. My research grew out of my own experiences of self-medicating with alcohol during my acting career and a long-standing question that emerged during my previous </w:t>
-      </w:r>
-      <w:proofErr w:type="gramStart"/>
-      <w:r>
-        <w:t>Master's</w:t>
-      </w:r>
-      <w:proofErr w:type="gramEnd"/>
-      <w:r>
-        <w:t> degree at Toi Whakaari: can the creativity and vulnerability I once believed alcohol provided be rediscovered through healthier pathways? </w:t>
+        <w:t>Hi, I'm Chris, a Master's student in Psychology in the NEST research group. Before returning to university, I spent more than forty years working professionally as an international actor. My research grew out of my own experiences of self-medicating with alcohol during my acting career and a long-standing question that emerged during my previous Master's degree at Toi Whakaari: can the creativity and vulnerability I once believed alcohol provided be rediscovered through healthier pathways? </w:t>
       </w:r>
     </w:p>
     <w:p>
@@ -541,15 +453,7 @@
     <w:p/>
     <w:p>
       <w:r>
-        <w:t xml:space="preserve">Kia ora! I’m Matt, a </w:t>
-      </w:r>
-      <w:proofErr w:type="gramStart"/>
-      <w:r>
-        <w:t>Master’s</w:t>
-      </w:r>
-      <w:proofErr w:type="gramEnd"/>
-      <w:r>
-        <w:t xml:space="preserve"> student within the NEST research group. This year, I am researching classical threat conditioning in planaria. Specifically, I want to determine whether these flatworms can be conditioned to associate specific environments with danger, and how substances such as benzodiazepines and psilocybin impact the acquisition or reconsolidation of these threat memories.</w:t>
+        <w:t>Kia ora! I’m Matt, a Master’s student within the NEST research group. This year, I am researching classical threat conditioning in planaria. Specifically, I want to determine whether these flatworms can be conditioned to associate specific environments with danger, and how substances such as benzodiazepines and psilocybin impact the acquisition or reconsolidation of these threat memories.</w:t>
       </w:r>
       <w:r>
         <w:br/>
@@ -578,15 +482,7 @@
     </w:p>
     <w:p>
       <w:r>
-        <w:t xml:space="preserve">Hiya! I'm Lena, a psychology student who is very excited to have joined the NEST research group in 2026 as part of my </w:t>
-      </w:r>
-      <w:proofErr w:type="gramStart"/>
-      <w:r>
-        <w:t>BSc(</w:t>
-      </w:r>
-      <w:proofErr w:type="gramEnd"/>
-      <w:r>
-        <w:t>Hons). Though I primarily have a passion for cognitive psychology, I thoroughly enjoyed studying cell biology, biopsychology, and biochemistry during my undergraduate years. I also love exploring the overlap and interaction between these fields, and so I am grateful for the opportunity to combine all my learning in a hands-on way through NEST! </w:t>
+        <w:t>Hiya! I'm Lena, a psychology student who is very excited to have joined the NEST research group in 2026 as part of my BSc(Hons). Though I primarily have a passion for cognitive psychology, I thoroughly enjoyed studying cell biology, biopsychology, and biochemistry during my undergraduate years. I also love exploring the overlap and interaction between these fields, and so I am grateful for the opportunity to combine all my learning in a hands-on way through NEST! </w:t>
       </w:r>
     </w:p>
     <w:p>
@@ -618,15 +514,7 @@
     </w:p>
     <w:p>
       <w:r>
-        <w:t xml:space="preserve">While my PhD focussed on HRV, my interest </w:t>
-      </w:r>
-      <w:proofErr w:type="gramStart"/>
-      <w:r>
-        <w:t>are</w:t>
-      </w:r>
-      <w:proofErr w:type="gramEnd"/>
-      <w:r>
-        <w:t xml:space="preserve"> multidisciplinary having conducted a broad range of experiments for my master’s thesis, from immunohistochemistry to examine neurogenesis in early development, to the rewarding nature of social interaction using conditioned place preference. Ive also been lucky to be included in many of the new exciting projects and collaborations over my years working within this research group, constantly learning and developing new skills which I can then teach others who are just as passionate about the research as I am.</w:t>
+        <w:t>While my PhD focussed on HRV, my interest are multidisciplinary having conducted a broad range of experiments for my master’s thesis, from immunohistochemistry to examine neurogenesis in early development, to the rewarding nature of social interaction using conditioned place preference. Ive also been lucky to be included in many of the new exciting projects and collaborations over my years working within this research group, constantly learning and developing new skills which I can then teach others who are just as passionate about the research as I am.</w:t>
       </w:r>
     </w:p>
     <w:p/>
@@ -643,17 +531,7 @@
     </w:p>
     <w:p>
       <w:r>
-        <w:t xml:space="preserve">I’m doing my </w:t>
-      </w:r>
-      <w:proofErr w:type="spellStart"/>
-      <w:proofErr w:type="gramStart"/>
-      <w:r>
-        <w:t>Masters</w:t>
-      </w:r>
-      <w:proofErr w:type="spellEnd"/>
-      <w:proofErr w:type="gramEnd"/>
-      <w:r>
-        <w:t xml:space="preserve"> Thesis in Cognitive and Behavioural Neuroscience, after getting my BSc majoring in Psych. For my thesis, I’m looking into the ways that hormonal changes affect brain activity, and how this might be moderated by genotype. I’m doing this through the help of my supervisors Bart Ellenbroek and Burt Hatch, using the Adolescent Brain Cognitive Development Study data, which looks at youth in USA. I'm passionate about neurophysiology and psychology, and hope that my work might help understand under-researched phenomena in female populations. </w:t>
+        <w:t>I’m doing my Masters Thesis in Cognitive and Behavioural Neuroscience, after getting my BSc majoring in Psych. For my thesis, I’m looking into the ways that hormonal changes affect brain activity, and how this might be moderated by genotype. I’m doing this through the help of my supervisors Bart Ellenbroek and Burt Hatch, using the Adolescent Brain Cognitive Development Study data, which looks at youth in USA. I'm passionate about neurophysiology and psychology, and hope that my work might help understand under-researched phenomena in female populations. </w:t>
       </w:r>
     </w:p>
     <w:p/>
@@ -664,6 +542,66 @@
     </w:p>
     <w:p/>
     <w:p/>
+    <w:p>
+      <w:r>
+        <w:br w:type="page"/>
+      </w:r>
+    </w:p>
+    <w:p>
+      <w:pPr>
+        <w:rPr>
+          <w:lang w:val="de-DE"/>
+        </w:rPr>
+      </w:pPr>
+      <w:r>
+        <w:rPr>
+          <w:lang w:val="de-DE"/>
+        </w:rPr>
+        <w:lastRenderedPageBreak/>
+        <w:t>Annie</w:t>
+      </w:r>
+      <w:r>
+        <w:rPr>
+          <w:lang w:val="de-DE"/>
+        </w:rPr>
+        <w:t xml:space="preserve"> </w:t>
+      </w:r>
+      <w:r>
+        <w:rPr>
+          <w:lang w:val="de-DE"/>
+        </w:rPr>
+        <w:t>J</w:t>
+      </w:r>
+      <w:r>
+        <w:rPr>
+          <w:lang w:val="de-DE"/>
+        </w:rPr>
+        <w:t>encova</w:t>
+      </w:r>
+    </w:p>
+    <w:p>
+      <w:r>
+        <w:rPr>
+          <w:lang w:val="de-DE"/>
+        </w:rPr>
+        <w:t xml:space="preserve">"Hi, I’m Annie! </w:t>
+      </w:r>
+      <w:r>
+        <w:t>I’m in Year 1 of my Masters in Cognitive and Behavioural Neuroscience, after earning my BSc in Neuroscience &amp; Behaviour at the University of New Hampshire in the United States! I have a passion for neuropsychology and understanding how brain-behaviour relationships can be altered by substance use disorders or traumatic brain injury. </w:t>
+      </w:r>
+    </w:p>
+    <w:p/>
+    <w:p>
+      <w:r>
+        <w:t>I am excited to be joining NEST and working alongside Bart Ellenbroek and Meyrick Kidwell for my CBNS 580 Project! We are trying to further understand the addictive properties of nicotine and tobacco using planaria.</w:t>
+      </w:r>
+    </w:p>
+    <w:p/>
+    <w:p>
+      <w:r>
+        <w:t>In my spare time you’ll find me coaching a competitive swim team here in Wellington, and training for an Ironman 70.3!"</w:t>
+      </w:r>
+    </w:p>
     <w:p/>
     <w:sectPr>
       <w:pgSz w:w="11906" w:h="16838"/>

</xml_diff>